<commit_message>
Add certifications, locator assignments 1-4, enrollment no. and guide
</commit_message>
<xml_diff>
--- a/submission/Selenium_Capstone_Submission.docx
+++ b/submission/Selenium_Capstone_Submission.docx
@@ -157,14 +157,14 @@
           <w:sz w:val="24"/>
           <w:szCs w:val="24"/>
         </w:rPr>
-        <w:t xml:space="preserve">Roll No.: </w:t>
+        <w:t xml:space="preserve">Enrollment No.: </w:t>
       </w:r>
       <w:r>
         <w:rPr>
           <w:sz w:val="24"/>
           <w:szCs w:val="24"/>
         </w:rPr>
-        <w:t xml:space="preserve">______________________</w:t>
+        <w:t xml:space="preserve">12023002001361</w:t>
       </w:r>
     </w:p>
     <w:p>
@@ -179,14 +179,14 @@
           <w:sz w:val="24"/>
           <w:szCs w:val="24"/>
         </w:rPr>
-        <w:t xml:space="preserve">Guide / Mentor: </w:t>
+        <w:t xml:space="preserve">Project Guide: </w:t>
       </w:r>
       <w:r>
         <w:rPr>
           <w:sz w:val="24"/>
           <w:szCs w:val="24"/>
         </w:rPr>
-        <w:t xml:space="preserve">______________________</w:t>
+        <w:t xml:space="preserve">Sramana Mukherjee</w:t>
       </w:r>
     </w:p>
     <w:p>

</xml_diff>